<commit_message>
antes de clase 7
</commit_message>
<xml_diff>
--- a/Tareas/Notebook Tarea Semana 5 Numero Secreto.docx
+++ b/Tareas/Notebook Tarea Semana 5 Numero Secreto.docx
@@ -94,17 +94,6 @@
       <w:pPr>
         <w:spacing w:after="160"/>
         <w:ind w:left="0"/>
-      </w:pPr>
-      <w:r>
-        <w:pict w14:anchorId="08C7A8AD">
-          <v:rect id="_x0000_i1026" style="width:0;height:1.5pt" o:hrstd="t" o:hr="t" fillcolor="#a0a0a0" stroked="f"/>
-        </w:pict>
-      </w:r>
-    </w:p>
-    <w:p>
-      <w:pPr>
-        <w:spacing w:after="160"/>
-        <w:ind w:left="0"/>
         <w:rPr>
           <w:b/>
           <w:bCs/>
@@ -126,7 +115,14 @@
           <w:sz w:val="28"/>
           <w:szCs w:val="20"/>
         </w:rPr>
-        <w:t>Tarea Clase 4</w:t>
+        <w:t xml:space="preserve">Tarea Clase </w:t>
+      </w:r>
+      <w:r>
+        <w:rPr>
+          <w:sz w:val="28"/>
+          <w:szCs w:val="20"/>
+        </w:rPr>
+        <w:t>5</w:t>
       </w:r>
     </w:p>
     <w:p>
@@ -169,32 +165,59 @@
         <w:spacing w:after="160"/>
         <w:ind w:left="0"/>
         <w:rPr>
-          <w:sz w:val="28"/>
-          <w:szCs w:val="20"/>
-        </w:rPr>
-      </w:pPr>
-      <w:r>
-        <w:rPr>
           <w:b/>
           <w:bCs/>
           <w:sz w:val="28"/>
           <w:szCs w:val="20"/>
         </w:rPr>
-        <w:t>URL del Repositorio Público:</w:t>
-      </w:r>
-      <w:r>
-        <w:rPr>
+      </w:pPr>
+      <w:r>
+        <w:rPr>
+          <w:b/>
+          <w:bCs/>
           <w:sz w:val="28"/>
           <w:szCs w:val="20"/>
         </w:rPr>
-        <w:br/>
+        <w:t>URL del Repositorio Público:</w:t>
       </w:r>
       <w:r>
         <w:rPr>
           <w:sz w:val="28"/>
           <w:szCs w:val="20"/>
         </w:rPr>
-        <w:t xml:space="preserve">Tareas/2. Segundo análisis de casos – Fundamentos de </w:t>
+        <w:br/>
+      </w:r>
+      <w:r>
+        <w:rPr>
+          <w:sz w:val="28"/>
+          <w:szCs w:val="20"/>
+        </w:rPr>
+        <w:t xml:space="preserve">Tareas. </w:t>
+      </w:r>
+      <w:r>
+        <w:rPr>
+          <w:b/>
+          <w:bCs/>
+          <w:sz w:val="28"/>
+          <w:szCs w:val="20"/>
+        </w:rPr>
+        <w:t>Adivina el número secreto</w:t>
+      </w:r>
+      <w:r>
+        <w:rPr>
+          <w:b/>
+          <w:bCs/>
+          <w:sz w:val="28"/>
+          <w:szCs w:val="20"/>
+        </w:rPr>
+        <w:t xml:space="preserve"> </w:t>
+      </w:r>
+      <w:r>
+        <w:rPr>
+          <w:sz w:val="28"/>
+          <w:szCs w:val="20"/>
+        </w:rPr>
+        <w:t xml:space="preserve">– Fundamentos de </w:t>
       </w:r>
       <w:proofErr w:type="spellStart"/>
       <w:r>
@@ -229,16 +252,9 @@
             <w:sz w:val="28"/>
             <w:szCs w:val="20"/>
           </w:rPr>
-          <w:t>https://github.com/Melany-Morales/2026C2-G03-PROGRAMACI-N/blob/main/Tareas/2.%20Segundo%20an%C3%A1lisis%20de%20casos%20%E2%80%93%20Fundamentos%20de%20Python.ipynb</w:t>
+          <w:t>https://github.com/Melany-Morales/2026C2-G03-PROGRAMACI-N/blob/main/Tareas/TAREA%20-%20Adivina%20el%20Numero.ipynb</w:t>
         </w:r>
       </w:hyperlink>
-      <w:r>
-        <w:rPr>
-          <w:sz w:val="28"/>
-          <w:szCs w:val="20"/>
-        </w:rPr>
-        <w:t xml:space="preserve"> </w:t>
-      </w:r>
     </w:p>
     <w:p>
       <w:pPr>
@@ -834,7 +850,6 @@
           <w:lang w:val="es-CR" w:eastAsia="en-US"/>
           <w14:ligatures w14:val="none"/>
         </w:rPr>
-        <w:lastRenderedPageBreak/>
         <w:t>Correo de entrega:</w:t>
       </w:r>
       <w:r>
@@ -3030,6 +3045,29 @@
       <w:szCs w:val="40"/>
     </w:rPr>
   </w:style>
+  <w:style w:type="paragraph" w:styleId="Ttulo2">
+    <w:name w:val="heading 2"/>
+    <w:basedOn w:val="Normal"/>
+    <w:next w:val="Normal"/>
+    <w:link w:val="Ttulo2Car"/>
+    <w:uiPriority w:val="9"/>
+    <w:semiHidden/>
+    <w:unhideWhenUsed/>
+    <w:qFormat/>
+    <w:rsid w:val="008D62EB"/>
+    <w:pPr>
+      <w:keepNext/>
+      <w:keepLines/>
+      <w:spacing w:before="40"/>
+      <w:outlineLvl w:val="1"/>
+    </w:pPr>
+    <w:rPr>
+      <w:rFonts w:asciiTheme="majorHAnsi" w:eastAsiaTheme="majorEastAsia" w:hAnsiTheme="majorHAnsi" w:cstheme="majorBidi"/>
+      <w:color w:val="0F4761" w:themeColor="accent1" w:themeShade="BF"/>
+      <w:sz w:val="26"/>
+      <w:szCs w:val="26"/>
+    </w:rPr>
+  </w:style>
   <w:style w:type="paragraph" w:styleId="Ttulo3">
     <w:name w:val="heading 3"/>
     <w:basedOn w:val="Normal"/>
@@ -3078,7 +3116,6 @@
   <w:style w:type="character" w:default="1" w:styleId="Fuentedeprrafopredeter">
     <w:name w:val="Default Paragraph Font"/>
     <w:uiPriority w:val="1"/>
-    <w:semiHidden/>
     <w:unhideWhenUsed/>
   </w:style>
   <w:style w:type="table" w:default="1" w:styleId="Tablanormal">
@@ -3345,6 +3382,20 @@
     <w:rPr>
       <w:color w:val="605E5C"/>
       <w:shd w:val="clear" w:color="auto" w:fill="E1DFDD"/>
+    </w:rPr>
+  </w:style>
+  <w:style w:type="character" w:customStyle="1" w:styleId="Ttulo2Car">
+    <w:name w:val="Título 2 Car"/>
+    <w:basedOn w:val="Fuentedeprrafopredeter"/>
+    <w:link w:val="Ttulo2"/>
+    <w:uiPriority w:val="9"/>
+    <w:semiHidden/>
+    <w:rsid w:val="008D62EB"/>
+    <w:rPr>
+      <w:rFonts w:asciiTheme="majorHAnsi" w:eastAsiaTheme="majorEastAsia" w:hAnsiTheme="majorHAnsi" w:cstheme="majorBidi"/>
+      <w:color w:val="0F4761" w:themeColor="accent1" w:themeShade="BF"/>
+      <w:sz w:val="26"/>
+      <w:szCs w:val="26"/>
     </w:rPr>
   </w:style>
 </w:styles>

</xml_diff>